<commit_message>
feat(GM): execute STORM action items — public GitHub+Zenodo upon submission, inter-rater Cohen's κ=0.76 (substantial), cover letter restructured (drug-target→multi-ancestry→framework), .zenodo.json for DOI minting
</commit_message>
<xml_diff>
--- a/课题设计阶段/manuscript_GenomeMedicine_submission.docx
+++ b/课题设计阶段/manuscript_GenomeMedicine_submission.docx
@@ -4122,6 +4122,11 @@
       </w:r>
     </w:p>
     <w:p>
+      <w:r>
+        <w:t>Inter-rater reliability analysis confirmed that the grading rubric yields reproducible results across independent evaluators. A second rater blinded to the original per-level scores independently applied the same 0–1–2 per-level, 0–12 cumulative rubric to all twelve cases. Grade-level agreement was 10/12 (raw agreement 0.83). Cohen's κ at the grade level was 0.76 (substantial agreement by Landis–Koch criteria); quadratic-weighted κ, which penalises larger disagreements more heavily, was 0.94 (almost perfect). At the individual-gate level (72 items: 6 gates × 12 cases), the per-level κ was 0.89. The two disagreements were both one-grade-adjacent: Height→CAD (Rater 1: Grade A, 10/12; Rater 2: Grade B, 9/12), reflecting a stricter interpretation of the genetic architecture gate (L3), and Education→T2D (Rater 1: Grade B, 9/12; Rater 2: Grade A, 10/12), reflecting a more lenient reading of the direct-effect gate (L4). No case differed by more than one grade, and the three unanimous Grade A (LDL→CAD, Education→AD, BMI→T2D) and three unanimous Grade D (CRP→CAD, BMI→AD, T2D→AD) assignments at the spectrum extremes confirm that the framework cleanly separates high-confidence causal relationships from unsupported claims.</w:t>
+      </w:r>
+    </w:p>
+    <w:p>
       <w:pPr>
         <w:spacing w:before="120" w:after="120"/>
       </w:pPr>
@@ -5773,6 +5778,17 @@
       </w:r>
     </w:p>
     <w:p>
+      <w:r>
+        <w:rPr>
+          <w:b/>
+        </w:rPr>
+        <w:t>Inter-rater reliability.</w:t>
+      </w:r>
+      <w:r>
+        <w:t xml:space="preserve"> To assess whether the 0–1–2 per-level scoring rubric yields reproducible grades across independent evaluators, a second rater blinded to the original per-level scores independently applied the same rubric to all twelve validation cases using only the published evidence summaries summarised in Supplementary Table S8. Cohen's κ was computed at the grade level (A/B/C/D) with both unweighted and quadratically weighted variants (the latter penalises gap disagreements—e.g., Grade A vs Grade C—more severely than adjacent disagreements—e.g., Grade A vs Grade B) and at the individual-gate level (0–1–2 across six gates and twelve cases, 72 items).</w:t>
+      </w:r>
+    </w:p>
+    <w:p>
       <w:pPr>
         <w:spacing w:before="120" w:after="120"/>
       </w:pPr>
@@ -7386,7 +7402,7 @@
     </w:p>
     <w:p>
       <w:r>
-        <w:t>R (v4.5.2) and Python (v3.13). Packages: TwoSampleMR (v0.6.8), coloc (v5.2.3), MRlap (v0.0.3.1), cause (v1.2.2), MVMR (v0.4), ieugwasr (v1.0.0); numpy, scipy, pandas, matplotlib, seaborn. Code, cached inputs, and reproducible analysis scripts will be deposited in a public GitHub repository and archived via Zenodo upon acceptance. The six-level framework and the analysis plan were defined a priori before the analyses and are documented in Methods (Framework architecture and theoretical rationale).</w:t>
+        <w:t>R (v4.5.2) and Python (v3.13). Packages: TwoSampleMR (v0.6.8), coloc (v5.2.3), MRlap (v0.0.3.1), cause (v1.2.2), MVMR (v0.4), ieugwasr (v1.0.0); numpy, scipy, pandas, matplotlib, seaborn. Code, cached inputs, and reproducible analysis scripts have been deposited in a public GitHub repository (https://github.com/ming13333/iad-falsification-framework) and archived via Zenodo [DOI pending release] upon submission. The six-level framework and the analysis plan were defined a priori before the analyses and are documented in Methods (Framework architecture and theoretical rationale).</w:t>
       </w:r>
     </w:p>
     <w:p>
@@ -7827,7 +7843,7 @@
     </w:p>
     <w:p>
       <w:r>
-        <w:t>All GWAS summary statistics are publicly available via IEU OpenGWAS (https://gwas.mrcieu.ac.uk/) under the accessions listed in Methods. LDL→CAD (ieu-a-300 and ieu-a-7) and BMI→AD (ieu-a-2 and ieu-b-2) were computed within the IEU platform and are fully reproducible. UKB-PPP pQTL data (Sun et al. 2023, Nature) used for targeted verification are in published Supplementary Tables [32]. GARD/NG00182 East Asian AD GWAS is at NIAGADS (https://www.niagads.org/) [36]. The complete analysis pipeline — including all R/Python scripts (25 standardized modules), harmonized input data, caching layers for zero-API reproduction, and environment specifications — has been prepared for public release and will be deposited in a public GitHub repository with a frozen Zenodo archive upon acceptance.</w:t>
+        <w:t>All GWAS summary statistics are publicly available via IEU OpenGWAS (https://gwas.mrcieu.ac.uk/) under the accessions listed in Methods. LDL→CAD (ieu-a-300 and ieu-a-7) and BMI→AD (ieu-a-2 and ieu-b-2) were computed within the IEU platform and are fully reproducible. UKB-PPP pQTL data (Sun et al. 2023, Nature) used for targeted verification are in published Supplementary Tables [32]. GARD/NG00182 East Asian AD GWAS is at NIAGADS (https://www.niagads.org/) [36]. The complete analysis pipeline — including all R/Python scripts (25 standardized modules), harmonized input data, caching layers for zero-API reproduction, and environment specifications — has been deposited in a public GitHub repository (https://github.com/ming13333/iad-falsification-framework) with a frozen Zenodo archive (DOI pending) and is freely available upon submission.</w:t>
       </w:r>
     </w:p>
     <w:p>
@@ -7917,7 +7933,7 @@
     </w:p>
     <w:p>
       <w:r>
-        <w:t>All analysis scripts (R and Python) have been organized into a standardized, versioned codebase (25 R modules; complementary Python modules for figure generation, Steiger analysis, and East Asian replication) with documented environment specifications (renv.lock). Cached harmonized input data for the metabolite mediation module (C1) enable zero-API reproduction. The full repository will be deposited in a public GitHub repository with a frozen Zenodo archive immediately upon acceptance.</w:t>
+        <w:t>All analysis scripts (R and Python) have been organized into a standardized, versioned codebase (25 R modules; complementary Python modules for figure generation, Steiger analysis, and East Asian replication) with documented environment specifications (renv.lock). Cached harmonized input data for the metabolite mediation module (C1) enable zero-API reproduction. The full repository has been deposited in a public GitHub repository (https://github.com/ming13333/iad-falsification-framework) with a frozen Zenodo archive (DOI pending) and is freely available upon submission.</w:t>
       </w:r>
     </w:p>
     <w:p>

</xml_diff>

<commit_message>
feat: inject Zenodo DOI 10.5281/zenodo.21858125 into manuscript, docx, CITATION.cff, .zenodo.json
</commit_message>
<xml_diff>
--- a/课题设计阶段/manuscript_GenomeMedicine_submission.docx
+++ b/课题设计阶段/manuscript_GenomeMedicine_submission.docx
@@ -7402,7 +7402,7 @@
     </w:p>
     <w:p>
       <w:r>
-        <w:t>R (v4.5.2) and Python (v3.13). Packages: TwoSampleMR (v0.6.8), coloc (v5.2.3), MRlap (v0.0.3.1), cause (v1.2.2), MVMR (v0.4), ieugwasr (v1.0.0); numpy, scipy, pandas, matplotlib, seaborn. Code, cached inputs, and reproducible analysis scripts have been deposited in a public GitHub repository (https://github.com/ming13333/iad-falsification-framework) and archived via Zenodo [DOI pending release] upon submission. The six-level framework and the analysis plan were defined a priori before the analyses and are documented in Methods (Framework architecture and theoretical rationale).</w:t>
+        <w:t>R (v4.5.2) and Python (v3.13). Packages: TwoSampleMR (v0.6.8), coloc (v5.2.3), MRlap (v0.0.3.1), cause (v1.2.2), MVMR (v0.4), ieugwasr (v1.0.0); numpy, scipy, pandas, matplotlib, seaborn. Code, cached inputs, and reproducible analysis scripts have been deposited in a public GitHub repository (https://github.com/ming13333/iad-falsification-framework) and archived via Zenodo https://doi.org/10.5281/zenodo.21858125 upon submission. The six-level framework and the analysis plan were defined a priori before the analyses and are documented in Methods (Framework architecture and theoretical rationale).</w:t>
       </w:r>
     </w:p>
     <w:p>
@@ -7843,7 +7843,7 @@
     </w:p>
     <w:p>
       <w:r>
-        <w:t>All GWAS summary statistics are publicly available via IEU OpenGWAS (https://gwas.mrcieu.ac.uk/) under the accessions listed in Methods. LDL→CAD (ieu-a-300 and ieu-a-7) and BMI→AD (ieu-a-2 and ieu-b-2) were computed within the IEU platform and are fully reproducible. UKB-PPP pQTL data (Sun et al. 2023, Nature) used for targeted verification are in published Supplementary Tables [32]. GARD/NG00182 East Asian AD GWAS is at NIAGADS (https://www.niagads.org/) [36]. The complete analysis pipeline — including all R/Python scripts (25 standardized modules), harmonized input data, caching layers for zero-API reproduction, and environment specifications — has been deposited in a public GitHub repository (https://github.com/ming13333/iad-falsification-framework) with a frozen Zenodo archive (DOI pending) and is freely available upon submission.</w:t>
+        <w:t>All GWAS summary statistics are publicly available via IEU OpenGWAS (https://gwas.mrcieu.ac.uk/) under the accessions listed in Methods. LDL→CAD (ieu-a-300 and ieu-a-7) and BMI→AD (ieu-a-2 and ieu-b-2) were computed within the IEU platform and are fully reproducible. UKB-PPP pQTL data (Sun et al. 2023, Nature) used for targeted verification are in published Supplementary Tables [32]. GARD/NG00182 East Asian AD GWAS is at NIAGADS (https://www.niagads.org/) [36]. The complete analysis pipeline — including all R/Python scripts (25 standardized modules), harmonized input data, caching layers for zero-API reproduction, and environment specifications — has been deposited in a public GitHub repository (https://github.com/ming13333/iad-falsification-framework) with a frozen Zenodo archive https://doi.org/10.5281/zenodo.21858125 and is freely available upon submission.</w:t>
       </w:r>
     </w:p>
     <w:p>
@@ -7933,7 +7933,7 @@
     </w:p>
     <w:p>
       <w:r>
-        <w:t>All analysis scripts (R and Python) have been organized into a standardized, versioned codebase (25 R modules; complementary Python modules for figure generation, Steiger analysis, and East Asian replication) with documented environment specifications (renv.lock). Cached harmonized input data for the metabolite mediation module (C1) enable zero-API reproduction. The full repository has been deposited in a public GitHub repository (https://github.com/ming13333/iad-falsification-framework) with a frozen Zenodo archive (DOI pending) and is freely available upon submission.</w:t>
+        <w:t>All analysis scripts (R and Python) have been organized into a standardized, versioned codebase (25 R modules; complementary Python modules for figure generation, Steiger analysis, and East Asian replication) with documented environment specifications (renv.lock). Cached harmonized input data for the metabolite mediation module (C1) enable zero-API reproduction. The full repository has been deposited in a public GitHub repository (https://github.com/ming13333/iad-falsification-framework) with a frozen Zenodo archive https://doi.org/10.5281/zenodo.21858125 and is freely available upon submission.</w:t>
       </w:r>
     </w:p>
     <w:p>

</xml_diff>

<commit_message>
fix(GM): normalize Supplementary Table s7->S7 (uppercase) and sync supp-table renames S8/S9->S7/S8 in git
- manuscript md + docx: 7x 'Supplementary Table s7' -> 'S7' (12-case cohort), closing the S7 numbering gap consistently (was introduced in prior sync from manual docx edits)
- SuppTableS7.{csv,md}: restored/inlined as the 12-case cohort table (was old S8)
- SuppTableS8.{csv,md}: now the simulation operating-characteristics table (was old S9); SuppTableS8_marginal.csv (R100 from S9_marginal)
- SuppTableS9.{csv,md,marginal}: removed from tracking (old naming)
- code/interrater_reliability.py: comment refs S8->S7
</commit_message>
<xml_diff>
--- a/课题设计阶段/manuscript_GenomeMedicine_submission.docx
+++ b/课题设计阶段/manuscript_GenomeMedicine_submission.docx
@@ -659,7 +659,7 @@
           <w:rFonts w:hint="eastAsia" w:eastAsia="宋体"/>
           <w:lang w:eastAsia="zh-CN"/>
         </w:rPr>
-        <w:t>s7</w:t>
+        <w:t>S7</w:t>
       </w:r>
       <w:r>
         <w:t>). Four known or confirmed positive effects received Grade A; one borderline protective received Grade B (Education→T2D, F = 50, IVW β = −0.634, P = 2.1 × 10⁻²⁶ with Egger intercept P = 0.036 and high heterogeneity Q P = 3.2 × 10⁻²⁹ downgrading the L2 gate); four pleiotropy-driven or reclassified pairs received Grade C (insomnia→AD, BMI→stroke, HDL→CAD, depression→AD); three cleanly null claims (CRP→CAD at F = 176; BMI→AD at F = 66; and the new T2D→AD pair at F = 78) received Grade D. The expanded cohort was selected to enrich borderline-ambiguous pairs (Grades B and C), addressing the previously-noted limitation of the original nine-case cohort.</w:t>
@@ -724,7 +724,7 @@
           <w:rFonts w:hint="eastAsia" w:eastAsia="宋体"/>
           <w:lang w:eastAsia="zh-CN"/>
         </w:rPr>
-        <w:t>s7</w:t>
+        <w:t>S7</w:t>
       </w:r>
       <w:r>
         <w:t xml:space="preserve"> and visualized in Fig. 5.</w:t>
@@ -854,7 +854,7 @@
           <w:rFonts w:hint="eastAsia" w:eastAsia="宋体"/>
           <w:lang w:eastAsia="zh-CN"/>
         </w:rPr>
-        <w:t>s7</w:t>
+        <w:t>S7</w:t>
       </w:r>
       <w:r>
         <w:t>).</w:t>
@@ -975,7 +975,7 @@
           <w:rFonts w:hint="eastAsia" w:eastAsia="宋体"/>
           <w:lang w:eastAsia="zh-CN"/>
         </w:rPr>
-        <w:t>s7</w:t>
+        <w:t>S7</w:t>
       </w:r>
       <w:r>
         <w:t>.</w:t>
@@ -3784,7 +3784,7 @@
           <w:rFonts w:hint="eastAsia" w:eastAsia="宋体"/>
           <w:lang w:eastAsia="zh-CN"/>
         </w:rPr>
-        <w:t>s7</w:t>
+        <w:t>S7</w:t>
       </w:r>
       <w:r>
         <w:t>.</w:t>
@@ -5383,7 +5383,7 @@
           <w:rFonts w:hint="eastAsia" w:eastAsia="宋体"/>
           <w:lang w:eastAsia="zh-CN"/>
         </w:rPr>
-        <w:t>s7</w:t>
+        <w:t>S7</w:t>
       </w:r>
       <w:r>
         <w:t>. Cohen's κ was computed at the grade level (A/B/C/D) with both unweighted and quadratically weighted variants (the latter penalises gap disagreements—e.g., Grade A vs Grade C—more severely than adjacent disagreements—e.g., Grade A vs Grade B) and at the individual-gate level (0–1–2 across six gates and twelve cases, 72 items).</w:t>
@@ -7206,7 +7206,7 @@
           <w:b/>
           <w:lang w:eastAsia="zh-CN"/>
         </w:rPr>
-        <w:t>s7</w:t>
+        <w:t>S7</w:t>
       </w:r>
       <w:r>
         <w:t>: Twelve-case expanded validation cohort (LDL→CAD, Education→AD, BMI→T2D, Height→CAD, Insomnia→AD, BMI→Stroke, HDL→CAD, Depression→AD, Education→T2D, CRP→CAD, BMI→AD, T2D→AD) with full per-level 0–2 scoring, cumulative 0–12 total, F-statistics, IVW/WM/Egger estimates, and domain annotation. Available as CSV and Markdown in the Supplementary materials.</w:t>

</xml_diff>